<commit_message>
added further fail safe finanace entery method called modify_category_combo
</commit_message>
<xml_diff>
--- a/temppci.docx
+++ b/temppci.docx
@@ -475,7 +475,7 @@
                   </w14:srgbClr>
                 </w14:shadow>
               </w:rPr>
-              <w:t>300</w:t>
+              <w:t>22</w:t>
             </w:r>
             <w:proofErr w:type="spellEnd"/>
             <w:r>
@@ -627,7 +627,7 @@
                   </w14:srgbClr>
                 </w14:shadow>
               </w:rPr>
-              <w:t>33</w:t>
+              <w:t>22</w:t>
             </w:r>
             <w:r>
               <w:rPr>

</xml_diff>